<commit_message>
update documento de estudio
</commit_message>
<xml_diff>
--- a/TESIS/📘 Documento de Estudio.docx
+++ b/TESIS/📘 Documento de Estudio.docx
@@ -22,23 +22,7 @@
           <w:b/>
           <w:bCs/>
         </w:rPr>
-        <w:t xml:space="preserve"> Documento de Estudio – Defensa Oral </w:t>
-      </w:r>
-      <w:proofErr w:type="spellStart"/>
-      <w:r>
-        <w:rPr>
-          <w:b/>
-          <w:bCs/>
-        </w:rPr>
-        <w:t>Bonkhead</w:t>
-      </w:r>
-      <w:proofErr w:type="spellEnd"/>
-      <w:r>
-        <w:rPr>
-          <w:b/>
-          <w:bCs/>
-        </w:rPr>
-        <w:t xml:space="preserve"> (Parte 1)</w:t>
+        <w:t xml:space="preserve"> Documento de Estudio – Defensa Oral Bonkhead (Parte 1)</w:t>
       </w:r>
     </w:p>
     <w:p>
@@ -192,13 +176,8 @@
       </w:r>
     </w:p>
     <w:p>
-      <w:proofErr w:type="spellStart"/>
-      <w:r>
-        <w:t>Bonkhead</w:t>
-      </w:r>
-      <w:proofErr w:type="spellEnd"/>
-      <w:r>
-        <w:t xml:space="preserve"> es un </w:t>
+      <w:r>
+        <w:t xml:space="preserve">Bonkhead es un </w:t>
       </w:r>
       <w:proofErr w:type="spellStart"/>
       <w:r>
@@ -263,13 +242,8 @@
       </w:r>
     </w:p>
     <w:p>
-      <w:proofErr w:type="spellStart"/>
-      <w:r>
-        <w:t>Bonkhead</w:t>
-      </w:r>
-      <w:proofErr w:type="spellEnd"/>
-      <w:r>
-        <w:t xml:space="preserve"> es un </w:t>
+      <w:r>
+        <w:t xml:space="preserve">Bonkhead es un </w:t>
       </w:r>
       <w:proofErr w:type="spellStart"/>
       <w:r>
@@ -416,15 +390,7 @@
     </w:p>
     <w:p>
       <w:r>
-        <w:t xml:space="preserve">A diferencia de otros juegos donde las habilidades solo desbloquean zonas, en </w:t>
-      </w:r>
-      <w:proofErr w:type="spellStart"/>
-      <w:r>
-        <w:t>Bonkhead</w:t>
-      </w:r>
-      <w:proofErr w:type="spellEnd"/>
-      <w:r>
-        <w:t xml:space="preserve"> cada habilidad transforma el diseño activo del espacio y exige reaprendizaje contextual.</w:t>
+        <w:t>A diferencia de otros juegos donde las habilidades solo desbloquean zonas, en Bonkhead cada habilidad transforma el diseño activo del espacio y exige reaprendizaje contextual.</w:t>
       </w:r>
     </w:p>
     <w:p>
@@ -1050,7 +1016,7 @@
     <w:p>
       <w:r>
         <w:pict w14:anchorId="056A4D2B">
-          <v:rect id="_x0000_i1084" style="width:0;height:1.5pt" o:hralign="center" o:hrstd="t" o:hr="t" fillcolor="#a0a0a0" stroked="f"/>
+          <v:rect id="_x0000_i1036" style="width:0;height:1.5pt" o:hralign="center" o:hrstd="t" o:hr="t" fillcolor="#a0a0a0" stroked="f"/>
         </w:pict>
       </w:r>
     </w:p>
@@ -1188,13 +1154,8 @@
       </w:r>
     </w:p>
     <w:p>
-      <w:proofErr w:type="spellStart"/>
-      <w:r>
-        <w:t>Bonkhead</w:t>
-      </w:r>
-      <w:proofErr w:type="spellEnd"/>
-      <w:r>
-        <w:t xml:space="preserve"> se posiciona dentro del nicho activo de </w:t>
+      <w:r>
+        <w:t xml:space="preserve">Bonkhead se posiciona dentro del nicho activo de </w:t>
       </w:r>
       <w:proofErr w:type="spellStart"/>
       <w:r>
@@ -1214,7 +1175,7 @@
       <w:r>
         <w:lastRenderedPageBreak/>
         <w:pict w14:anchorId="5A1F0CF0">
-          <v:rect id="_x0000_i1085" style="width:0;height:1.5pt" o:hralign="center" o:hrstd="t" o:hr="t" fillcolor="#a0a0a0" stroked="f"/>
+          <v:rect id="_x0000_i1037" style="width:0;height:1.5pt" o:hralign="center" o:hrstd="t" o:hr="t" fillcolor="#a0a0a0" stroked="f"/>
         </w:pict>
       </w:r>
     </w:p>
@@ -1353,62 +1314,98 @@
     </w:p>
     <w:p>
       <w:r>
-        <w:t xml:space="preserve">Es cierto que existe competencia, pero </w:t>
+        <w:t>Es cierto que existe competencia, pero Bonkhead no busca destacarse por volumen de contenido ni por estética extrema, sino por claridad mecánica y estructura progresiva.</w:t>
+      </w:r>
+    </w:p>
+    <w:p>
+      <w:r>
+        <w:t>El diferencial es que la progresión no se basa en estadísticas ni en aumento de poder, sino en ampliación de capacidades. Cada nueva habilidad reconfigura cómo se interpreta el espacio.</w:t>
+      </w:r>
+    </w:p>
+    <w:p>
+      <w:r>
+        <w:t>La experiencia se centra en dominio real del jugador, no en acumulación numérica. Eso genera una identidad clara dentro del género.</w:t>
+      </w:r>
+    </w:p>
+    <w:p>
+      <w:r>
+        <w:pict w14:anchorId="7440345E">
+          <v:rect id="_x0000_i1038" style="width:0;height:1.5pt" o:hralign="center" o:hrstd="t" o:hr="t" fillcolor="#a0a0a0" stroked="f"/>
+        </w:pict>
+      </w:r>
+    </w:p>
+    <w:p>
+      <w:pPr>
+        <w:rPr>
+          <w:b/>
+          <w:bCs/>
+        </w:rPr>
+      </w:pPr>
+      <w:r>
+        <w:rPr>
+          <w:b/>
+          <w:bCs/>
+        </w:rPr>
+        <w:t>3️</w:t>
+      </w:r>
+      <w:r>
+        <w:rPr>
+          <w:rFonts w:ascii="Segoe UI Symbol" w:hAnsi="Segoe UI Symbol" w:cs="Segoe UI Symbol"/>
+          <w:b/>
+          <w:bCs/>
+        </w:rPr>
+        <w:t>⃣</w:t>
+      </w:r>
+      <w:r>
+        <w:rPr>
+          <w:b/>
+          <w:bCs/>
+        </w:rPr>
+        <w:t xml:space="preserve"> Público objetivo</w:t>
+      </w:r>
+    </w:p>
+    <w:p>
+      <w:pPr>
+        <w:rPr>
+          <w:b/>
+          <w:bCs/>
+        </w:rPr>
+      </w:pPr>
+      <w:r>
+        <w:rPr>
+          <w:rFonts w:ascii="Segoe UI Emoji" w:hAnsi="Segoe UI Emoji" w:cs="Segoe UI Emoji"/>
+          <w:b/>
+          <w:bCs/>
+        </w:rPr>
+        <w:t>❓</w:t>
+      </w:r>
+      <w:r>
+        <w:rPr>
+          <w:b/>
+          <w:bCs/>
+        </w:rPr>
+        <w:t xml:space="preserve"> Pregunta del </w:t>
       </w:r>
       <w:proofErr w:type="spellStart"/>
       <w:r>
-        <w:t>Bonkhead</w:t>
+        <w:rPr>
+          <w:b/>
+          <w:bCs/>
+        </w:rPr>
+        <w:t>publisher</w:t>
       </w:r>
       <w:proofErr w:type="spellEnd"/>
       <w:r>
-        <w:t xml:space="preserve"> no busca destacarse por volumen de contenido ni por estética extrema, sino por claridad mecánica y estructura progresiva.</w:t>
-      </w:r>
-    </w:p>
-    <w:p>
-      <w:r>
-        <w:t>El diferencial es que la progresión no se basa en estadísticas ni en aumento de poder, sino en ampliación de capacidades. Cada nueva habilidad reconfigura cómo se interpreta el espacio.</w:t>
-      </w:r>
-    </w:p>
-    <w:p>
-      <w:r>
-        <w:t>La experiencia se centra en dominio real del jugador, no en acumulación numérica. Eso genera una identidad clara dentro del género.</w:t>
-      </w:r>
-    </w:p>
-    <w:p>
-      <w:r>
-        <w:pict w14:anchorId="7440345E">
-          <v:rect id="_x0000_i1086" style="width:0;height:1.5pt" o:hralign="center" o:hrstd="t" o:hr="t" fillcolor="#a0a0a0" stroked="f"/>
-        </w:pict>
-      </w:r>
-    </w:p>
-    <w:p>
-      <w:pPr>
-        <w:rPr>
-          <w:b/>
-          <w:bCs/>
-        </w:rPr>
-      </w:pPr>
-      <w:r>
-        <w:rPr>
-          <w:b/>
-          <w:bCs/>
-        </w:rPr>
-        <w:t>3️</w:t>
-      </w:r>
-      <w:r>
-        <w:rPr>
-          <w:rFonts w:ascii="Segoe UI Symbol" w:hAnsi="Segoe UI Symbol" w:cs="Segoe UI Symbol"/>
-          <w:b/>
-          <w:bCs/>
-        </w:rPr>
-        <w:t>⃣</w:t>
-      </w:r>
-      <w:r>
-        <w:rPr>
-          <w:b/>
-          <w:bCs/>
-        </w:rPr>
-        <w:t xml:space="preserve"> Público objetivo</w:t>
+        <w:rPr>
+          <w:b/>
+          <w:bCs/>
+        </w:rPr>
+        <w:t>:</w:t>
+      </w:r>
+    </w:p>
+    <w:p>
+      <w:r>
+        <w:t>¿Quién es tu público objetivo concreto?</w:t>
       </w:r>
     </w:p>
     <w:p>
@@ -1424,115 +1421,71 @@
           <w:b/>
           <w:bCs/>
         </w:rPr>
-        <w:t>❓</w:t>
-      </w:r>
-      <w:r>
-        <w:rPr>
-          <w:b/>
-          <w:bCs/>
-        </w:rPr>
-        <w:t xml:space="preserve"> Pregunta del </w:t>
+        <w:t>🎯</w:t>
+      </w:r>
+      <w:r>
+        <w:rPr>
+          <w:b/>
+          <w:bCs/>
+        </w:rPr>
+        <w:t xml:space="preserve"> Idea central:</w:t>
+      </w:r>
+    </w:p>
+    <w:p>
+      <w:r>
+        <w:t>Adultos con poco tiempo que valoran desafío concentrado y dominio mecánico.</w:t>
+      </w:r>
+    </w:p>
+    <w:p>
+      <w:pPr>
+        <w:rPr>
+          <w:b/>
+          <w:bCs/>
+        </w:rPr>
+      </w:pPr>
+      <w:r>
+        <w:rPr>
+          <w:rFonts w:ascii="Segoe UI Emoji" w:hAnsi="Segoe UI Emoji" w:cs="Segoe UI Emoji"/>
+          <w:b/>
+          <w:bCs/>
+        </w:rPr>
+        <w:t>🗣️</w:t>
+      </w:r>
+      <w:r>
+        <w:rPr>
+          <w:b/>
+          <w:bCs/>
+        </w:rPr>
+        <w:t xml:space="preserve"> Texto para estudiar:</w:t>
+      </w:r>
+    </w:p>
+    <w:p>
+      <w:r>
+        <w:t>El público principal son jugadores adultos que crecieron con plataformas clásicas y que hoy buscan experiencias más acotadas en duración pero igualmente desafiantes.</w:t>
+      </w:r>
+    </w:p>
+    <w:p>
+      <w:r>
+        <w:t>Son personas que no disponen de largas sesiones para juegos AAA extensos, pero sí valoran experiencias intensas, estructuradas y que generen sensación de superación.</w:t>
+      </w:r>
+    </w:p>
+    <w:p>
+      <w:r>
+        <w:t xml:space="preserve">También apunta a jugadores que disfrutan mejorar rendimiento y optimizar ejecución, lo que aporta </w:t>
       </w:r>
       <w:proofErr w:type="spellStart"/>
       <w:r>
-        <w:rPr>
-          <w:b/>
-          <w:bCs/>
-        </w:rPr>
-        <w:t>publisher</w:t>
+        <w:t>rejugabilidad</w:t>
       </w:r>
       <w:proofErr w:type="spellEnd"/>
       <w:r>
-        <w:rPr>
-          <w:b/>
-          <w:bCs/>
-        </w:rPr>
-        <w:t>:</w:t>
-      </w:r>
-    </w:p>
-    <w:p>
-      <w:r>
-        <w:t>¿Quién es tu público objetivo concreto?</w:t>
-      </w:r>
-    </w:p>
-    <w:p>
-      <w:pPr>
-        <w:rPr>
-          <w:b/>
-          <w:bCs/>
-        </w:rPr>
-      </w:pPr>
-      <w:r>
-        <w:rPr>
-          <w:rFonts w:ascii="Segoe UI Emoji" w:hAnsi="Segoe UI Emoji" w:cs="Segoe UI Emoji"/>
-          <w:b/>
-          <w:bCs/>
-        </w:rPr>
-        <w:t>🎯</w:t>
-      </w:r>
-      <w:r>
-        <w:rPr>
-          <w:b/>
-          <w:bCs/>
-        </w:rPr>
-        <w:t xml:space="preserve"> Idea central:</w:t>
-      </w:r>
-    </w:p>
-    <w:p>
-      <w:r>
-        <w:t>Adultos con poco tiempo que valoran desafío concentrado y dominio mecánico.</w:t>
-      </w:r>
-    </w:p>
-    <w:p>
-      <w:pPr>
-        <w:rPr>
-          <w:b/>
-          <w:bCs/>
-        </w:rPr>
-      </w:pPr>
-      <w:r>
-        <w:rPr>
-          <w:rFonts w:ascii="Segoe UI Emoji" w:hAnsi="Segoe UI Emoji" w:cs="Segoe UI Emoji"/>
-          <w:b/>
-          <w:bCs/>
-        </w:rPr>
-        <w:t>🗣️</w:t>
-      </w:r>
-      <w:r>
-        <w:rPr>
-          <w:b/>
-          <w:bCs/>
-        </w:rPr>
-        <w:t xml:space="preserve"> Texto para estudiar:</w:t>
-      </w:r>
-    </w:p>
-    <w:p>
-      <w:r>
-        <w:t>El público principal son jugadores adultos que crecieron con plataformas clásicas y que hoy buscan experiencias más acotadas en duración pero igualmente desafiantes.</w:t>
-      </w:r>
-    </w:p>
-    <w:p>
-      <w:r>
-        <w:t>Son personas que no disponen de largas sesiones para juegos AAA extensos, pero sí valoran experiencias intensas, estructuradas y que generen sensación de superación.</w:t>
-      </w:r>
-    </w:p>
-    <w:p>
-      <w:r>
-        <w:t xml:space="preserve">También apunta a jugadores que disfrutan mejorar rendimiento y optimizar ejecución, lo que aporta </w:t>
-      </w:r>
-      <w:proofErr w:type="spellStart"/>
-      <w:r>
-        <w:t>rejugabilidad</w:t>
-      </w:r>
-      <w:proofErr w:type="spellEnd"/>
-      <w:r>
         <w:t xml:space="preserve"> natural.</w:t>
       </w:r>
     </w:p>
     <w:p>
       <w:r>
         <w:pict w14:anchorId="5E25EA8A">
-          <v:rect id="_x0000_i1087" style="width:0;height:1.5pt" o:hralign="center" o:hrstd="t" o:hr="t" fillcolor="#a0a0a0" stroked="f"/>
+          <v:rect id="_x0000_i1039" style="width:0;height:1.5pt" o:hralign="center" o:hrstd="t" o:hr="t" fillcolor="#a0a0a0" stroked="f"/>
         </w:pict>
       </w:r>
     </w:p>
@@ -1696,7 +1649,7 @@
     <w:p>
       <w:r>
         <w:pict w14:anchorId="6FA39BA7">
-          <v:rect id="_x0000_i1088" style="width:0;height:1.5pt" o:hralign="center" o:hrstd="t" o:hr="t" fillcolor="#a0a0a0" stroked="f"/>
+          <v:rect id="_x0000_i1040" style="width:0;height:1.5pt" o:hralign="center" o:hrstd="t" o:hr="t" fillcolor="#a0a0a0" stroked="f"/>
         </w:pict>
       </w:r>
     </w:p>
@@ -1851,7 +1804,7 @@
     <w:p>
       <w:r>
         <w:pict w14:anchorId="7297489B">
-          <v:rect id="_x0000_i1089" style="width:0;height:1.5pt" o:hralign="center" o:hrstd="t" o:hr="t" fillcolor="#a0a0a0" stroked="f"/>
+          <v:rect id="_x0000_i1041" style="width:0;height:1.5pt" o:hralign="center" o:hrstd="t" o:hr="t" fillcolor="#a0a0a0" stroked="f"/>
         </w:pict>
       </w:r>
     </w:p>
@@ -2007,7 +1960,7 @@
       <w:r>
         <w:lastRenderedPageBreak/>
         <w:pict w14:anchorId="30C954BA">
-          <v:rect id="_x0000_i1090" style="width:0;height:1.5pt" o:hralign="center" o:hrstd="t" o:hr="t" fillcolor="#a0a0a0" stroked="f"/>
+          <v:rect id="_x0000_i1042" style="width:0;height:1.5pt" o:hralign="center" o:hrstd="t" o:hr="t" fillcolor="#a0a0a0" stroked="f"/>
         </w:pict>
       </w:r>
     </w:p>
@@ -2148,15 +2101,7 @@
     </w:p>
     <w:p>
       <w:r>
-        <w:t xml:space="preserve">Además, valoro el </w:t>
-      </w:r>
-      <w:proofErr w:type="spellStart"/>
-      <w:r>
-        <w:t>feedback</w:t>
-      </w:r>
-      <w:proofErr w:type="spellEnd"/>
-      <w:r>
-        <w:t xml:space="preserve"> externo y el trabajo colaborativo, lo que reduce riesgos creativos y mejora la calidad final del producto.</w:t>
+        <w:t>Además, valoro el feedback externo y el trabajo colaborativo, lo que reduce riesgos creativos y mejora la calidad final del producto.</w:t>
       </w:r>
     </w:p>
     <w:p>
@@ -2167,7 +2112,7 @@
     <w:p>
       <w:r>
         <w:pict w14:anchorId="36C42522">
-          <v:rect id="_x0000_i1091" style="width:0;height:1.5pt" o:hralign="center" o:hrstd="t" o:hr="t" fillcolor="#a0a0a0" stroked="f"/>
+          <v:rect id="_x0000_i1043" style="width:0;height:1.5pt" o:hralign="center" o:hrstd="t" o:hr="t" fillcolor="#a0a0a0" stroked="f"/>
         </w:pict>
       </w:r>
     </w:p>
@@ -2312,6 +2257,1404 @@
       <w:proofErr w:type="spellEnd"/>
       <w:r>
         <w:t xml:space="preserve"> con tus palabras.</w:t>
+      </w:r>
+    </w:p>
+    <w:p/>
+    <w:p/>
+    <w:p/>
+    <w:p/>
+    <w:p>
+      <w:pPr>
+        <w:rPr>
+          <w:b/>
+          <w:bCs/>
+        </w:rPr>
+      </w:pPr>
+      <w:r>
+        <w:rPr>
+          <w:rFonts w:ascii="Segoe UI Emoji" w:hAnsi="Segoe UI Emoji" w:cs="Segoe UI Emoji"/>
+          <w:b/>
+          <w:bCs/>
+        </w:rPr>
+        <w:lastRenderedPageBreak/>
+        <w:t>🧠</w:t>
+      </w:r>
+      <w:r>
+        <w:rPr>
+          <w:b/>
+          <w:bCs/>
+        </w:rPr>
+        <w:t xml:space="preserve"> Estructura ideal de la demo (20 minutos)</w:t>
+      </w:r>
+    </w:p>
+    <w:p>
+      <w:proofErr w:type="spellStart"/>
+      <w:r>
+        <w:t>Dividila</w:t>
+      </w:r>
+      <w:proofErr w:type="spellEnd"/>
+      <w:r>
+        <w:t xml:space="preserve"> mentalmente en </w:t>
+      </w:r>
+      <w:r>
+        <w:rPr>
+          <w:b/>
+          <w:bCs/>
+        </w:rPr>
+        <w:t>4 momentos</w:t>
+      </w:r>
+      <w:r>
+        <w:t>.</w:t>
+      </w:r>
+    </w:p>
+    <w:p>
+      <w:r>
+        <w:t>1️</w:t>
+      </w:r>
+      <w:r>
+        <w:rPr>
+          <w:rFonts w:ascii="Segoe UI Symbol" w:hAnsi="Segoe UI Symbol" w:cs="Segoe UI Symbol"/>
+        </w:rPr>
+        <w:t>⃣</w:t>
+      </w:r>
+      <w:r>
+        <w:t xml:space="preserve"> Introducción de mecánica</w:t>
+      </w:r>
+      <w:r>
+        <w:br/>
+        <w:t>2️</w:t>
+      </w:r>
+      <w:r>
+        <w:rPr>
+          <w:rFonts w:ascii="Segoe UI Symbol" w:hAnsi="Segoe UI Symbol" w:cs="Segoe UI Symbol"/>
+        </w:rPr>
+        <w:t>⃣</w:t>
+      </w:r>
+      <w:r>
+        <w:t xml:space="preserve"> Desarrollo de dominio</w:t>
+      </w:r>
+      <w:r>
+        <w:br/>
+        <w:t>3️</w:t>
+      </w:r>
+      <w:r>
+        <w:rPr>
+          <w:rFonts w:ascii="Segoe UI Symbol" w:hAnsi="Segoe UI Symbol" w:cs="Segoe UI Symbol"/>
+        </w:rPr>
+        <w:t>⃣</w:t>
+      </w:r>
+      <w:r>
+        <w:t xml:space="preserve"> Presión del entorno</w:t>
+      </w:r>
+      <w:r>
+        <w:br/>
+        <w:t>4️</w:t>
+      </w:r>
+      <w:r>
+        <w:rPr>
+          <w:rFonts w:ascii="Segoe UI Symbol" w:hAnsi="Segoe UI Symbol" w:cs="Segoe UI Symbol"/>
+        </w:rPr>
+        <w:t>⃣</w:t>
+      </w:r>
+      <w:r>
+        <w:t xml:space="preserve"> Culminación del desafío</w:t>
+      </w:r>
+    </w:p>
+    <w:p>
+      <w:r>
+        <w:t>Esto coincide perfecto con tu filosofía de diseño progresivo.</w:t>
+      </w:r>
+    </w:p>
+    <w:p>
+      <w:r>
+        <w:pict w14:anchorId="0E07E085">
+          <v:rect id="_x0000_i1164" style="width:0;height:1.5pt" o:hralign="center" o:hrstd="t" o:hr="t" fillcolor="#a0a0a0" stroked="f"/>
+        </w:pict>
+      </w:r>
+    </w:p>
+    <w:p>
+      <w:pPr>
+        <w:rPr>
+          <w:b/>
+          <w:bCs/>
+        </w:rPr>
+      </w:pPr>
+      <w:r>
+        <w:rPr>
+          <w:b/>
+          <w:bCs/>
+        </w:rPr>
+        <w:t>1️</w:t>
+      </w:r>
+      <w:r>
+        <w:rPr>
+          <w:rFonts w:ascii="Segoe UI Symbol" w:hAnsi="Segoe UI Symbol" w:cs="Segoe UI Symbol"/>
+          <w:b/>
+          <w:bCs/>
+        </w:rPr>
+        <w:t>⃣</w:t>
+      </w:r>
+      <w:r>
+        <w:rPr>
+          <w:b/>
+          <w:bCs/>
+        </w:rPr>
+        <w:t xml:space="preserve"> Introducción de mecánica (primeros minutos)</w:t>
+      </w:r>
+    </w:p>
+    <w:p>
+      <w:pPr>
+        <w:rPr>
+          <w:b/>
+          <w:bCs/>
+        </w:rPr>
+      </w:pPr>
+      <w:r>
+        <w:rPr>
+          <w:b/>
+          <w:bCs/>
+        </w:rPr>
+        <w:t>Qué mostrar</w:t>
+      </w:r>
+    </w:p>
+    <w:p>
+      <w:r>
+        <w:t xml:space="preserve">El momento donde el jugador </w:t>
+      </w:r>
+      <w:r>
+        <w:rPr>
+          <w:b/>
+          <w:bCs/>
+        </w:rPr>
+        <w:t>aprende la habilidad nueva</w:t>
+      </w:r>
+      <w:r>
+        <w:t>.</w:t>
+      </w:r>
+    </w:p>
+    <w:p>
+      <w:r>
+        <w:t>Ejemplo que vos mencionaste:</w:t>
+      </w:r>
+    </w:p>
+    <w:p>
+      <w:pPr>
+        <w:numPr>
+          <w:ilvl w:val="0"/>
+          <w:numId w:val="6"/>
+        </w:numPr>
+      </w:pPr>
+      <w:r>
+        <w:t>Carteles de tutorial</w:t>
+      </w:r>
+    </w:p>
+    <w:p>
+      <w:pPr>
+        <w:numPr>
+          <w:ilvl w:val="0"/>
+          <w:numId w:val="6"/>
+        </w:numPr>
+      </w:pPr>
+      <w:r>
+        <w:t>Zona segura para probar la mecánica</w:t>
+      </w:r>
+    </w:p>
+    <w:p>
+      <w:r>
+        <w:pict w14:anchorId="5F3D0E9A">
+          <v:rect id="_x0000_i1165" style="width:0;height:1.5pt" o:hralign="center" o:hrstd="t" o:hr="t" fillcolor="#a0a0a0" stroked="f"/>
+        </w:pict>
+      </w:r>
+    </w:p>
+    <w:p>
+      <w:pPr>
+        <w:rPr>
+          <w:b/>
+          <w:bCs/>
+        </w:rPr>
+      </w:pPr>
+      <w:r>
+        <w:rPr>
+          <w:b/>
+          <w:bCs/>
+        </w:rPr>
+        <w:t>Pregunta que te podría hacer el docente</w:t>
+      </w:r>
+    </w:p>
+    <w:p>
+      <w:r>
+        <w:t>"¿Por qué decidiste enseñar la mecánica de esta forma?"</w:t>
+      </w:r>
+    </w:p>
+    <w:p>
+      <w:r>
+        <w:pict w14:anchorId="4466244E">
+          <v:rect id="_x0000_i1166" style="width:0;height:1.5pt" o:hralign="center" o:hrstd="t" o:hr="t" fillcolor="#a0a0a0" stroked="f"/>
+        </w:pict>
+      </w:r>
+    </w:p>
+    <w:p>
+      <w:pPr>
+        <w:rPr>
+          <w:b/>
+          <w:bCs/>
+        </w:rPr>
+      </w:pPr>
+      <w:r>
+        <w:rPr>
+          <w:b/>
+          <w:bCs/>
+        </w:rPr>
+        <w:t xml:space="preserve">Respuesta que </w:t>
+      </w:r>
+      <w:proofErr w:type="spellStart"/>
+      <w:r>
+        <w:rPr>
+          <w:b/>
+          <w:bCs/>
+        </w:rPr>
+        <w:t>podés</w:t>
+      </w:r>
+      <w:proofErr w:type="spellEnd"/>
+      <w:r>
+        <w:rPr>
+          <w:b/>
+          <w:bCs/>
+        </w:rPr>
+        <w:t xml:space="preserve"> estudiar</w:t>
+      </w:r>
+    </w:p>
+    <w:p>
+      <w:r>
+        <w:t>La introducción de cada mecánica está diseñada para que el jugador pueda comprenderla sin presión.</w:t>
+      </w:r>
+      <w:r>
+        <w:br/>
+        <w:t>Por eso al inicio del nivel aparecen carteles tutoriales y una zona relativamente segura donde el jugador puede experimentar con la nueva habilidad.</w:t>
+      </w:r>
+    </w:p>
+    <w:p>
+      <w:r>
+        <w:t>La intención es que el jugador primero entienda el funcionamiento básico de la mecánica antes de enfrentarse a situaciones más complejas.</w:t>
+      </w:r>
+    </w:p>
+    <w:p>
+      <w:r>
+        <w:t>Este enfoque permite que el aprendizaje sea progresivo.</w:t>
+      </w:r>
+      <w:r>
+        <w:br/>
+        <w:t>Primero se introduce la herramienta, luego se la pone a prueba en escenarios cada vez más exigentes.</w:t>
+      </w:r>
+    </w:p>
+    <w:p>
+      <w:r>
+        <w:t>De esta forma el jugador no siente que el juego es injusto, sino que siente que está desarrollando su habilidad a medida que avanza.</w:t>
+      </w:r>
+    </w:p>
+    <w:p>
+      <w:r>
+        <w:pict w14:anchorId="1D8B8F91">
+          <v:rect id="_x0000_i1167" style="width:0;height:1.5pt" o:hralign="center" o:hrstd="t" o:hr="t" fillcolor="#a0a0a0" stroked="f"/>
+        </w:pict>
+      </w:r>
+    </w:p>
+    <w:p>
+      <w:pPr>
+        <w:rPr>
+          <w:b/>
+          <w:bCs/>
+        </w:rPr>
+      </w:pPr>
+      <w:r>
+        <w:rPr>
+          <w:b/>
+          <w:bCs/>
+        </w:rPr>
+        <w:t>Idea central</w:t>
+      </w:r>
+    </w:p>
+    <w:p>
+      <w:r>
+        <w:rPr>
+          <w:rFonts w:ascii="Segoe UI Emoji" w:hAnsi="Segoe UI Emoji" w:cs="Segoe UI Emoji"/>
+        </w:rPr>
+        <w:t>🧠</w:t>
+      </w:r>
+      <w:r>
+        <w:t xml:space="preserve"> </w:t>
+      </w:r>
+      <w:r>
+        <w:rPr>
+          <w:b/>
+          <w:bCs/>
+        </w:rPr>
+        <w:t>Primero comprensión, después desafío.</w:t>
+      </w:r>
+    </w:p>
+    <w:p>
+      <w:r>
+        <w:lastRenderedPageBreak/>
+        <w:pict w14:anchorId="0E0F6F3E">
+          <v:rect id="_x0000_i1168" style="width:0;height:1.5pt" o:hralign="center" o:hrstd="t" o:hr="t" fillcolor="#a0a0a0" stroked="f"/>
+        </w:pict>
+      </w:r>
+    </w:p>
+    <w:p>
+      <w:pPr>
+        <w:rPr>
+          <w:b/>
+          <w:bCs/>
+        </w:rPr>
+      </w:pPr>
+      <w:r>
+        <w:rPr>
+          <w:b/>
+          <w:bCs/>
+        </w:rPr>
+        <w:t>2️</w:t>
+      </w:r>
+      <w:r>
+        <w:rPr>
+          <w:rFonts w:ascii="Segoe UI Symbol" w:hAnsi="Segoe UI Symbol" w:cs="Segoe UI Symbol"/>
+          <w:b/>
+          <w:bCs/>
+        </w:rPr>
+        <w:t>⃣</w:t>
+      </w:r>
+      <w:r>
+        <w:rPr>
+          <w:b/>
+          <w:bCs/>
+        </w:rPr>
+        <w:t xml:space="preserve"> Desarrollo de dominio</w:t>
+      </w:r>
+    </w:p>
+    <w:p>
+      <w:r>
+        <w:t>Acá el jugador ya entendió la habilidad.</w:t>
+      </w:r>
+    </w:p>
+    <w:p>
+      <w:r>
+        <w:t xml:space="preserve">Ahora el nivel empieza a </w:t>
+      </w:r>
+      <w:r>
+        <w:rPr>
+          <w:b/>
+          <w:bCs/>
+        </w:rPr>
+        <w:t>pedirle que la use realmente</w:t>
+      </w:r>
+      <w:r>
+        <w:t>.</w:t>
+      </w:r>
+    </w:p>
+    <w:p>
+      <w:r>
+        <w:pict w14:anchorId="012B4E88">
+          <v:rect id="_x0000_i1169" style="width:0;height:1.5pt" o:hralign="center" o:hrstd="t" o:hr="t" fillcolor="#a0a0a0" stroked="f"/>
+        </w:pict>
+      </w:r>
+    </w:p>
+    <w:p>
+      <w:pPr>
+        <w:rPr>
+          <w:b/>
+          <w:bCs/>
+        </w:rPr>
+      </w:pPr>
+      <w:r>
+        <w:rPr>
+          <w:b/>
+          <w:bCs/>
+        </w:rPr>
+        <w:t xml:space="preserve">Qué explicar mientras </w:t>
+      </w:r>
+      <w:proofErr w:type="spellStart"/>
+      <w:r>
+        <w:rPr>
+          <w:b/>
+          <w:bCs/>
+        </w:rPr>
+        <w:t>jugás</w:t>
+      </w:r>
+      <w:proofErr w:type="spellEnd"/>
+    </w:p>
+    <w:p>
+      <w:proofErr w:type="spellStart"/>
+      <w:r>
+        <w:t>Podés</w:t>
+      </w:r>
+      <w:proofErr w:type="spellEnd"/>
+      <w:r>
+        <w:t xml:space="preserve"> decir algo como:</w:t>
+      </w:r>
+    </w:p>
+    <w:p>
+      <w:r>
+        <w:t>"En esta parte del nivel el jugador ya entendió la habilidad, entonces el diseño empieza a exigir que la combine con las mecánicas anteriores."</w:t>
+      </w:r>
+    </w:p>
+    <w:p>
+      <w:r>
+        <w:t xml:space="preserve">Esto es importante porque muestra </w:t>
+      </w:r>
+      <w:r>
+        <w:rPr>
+          <w:b/>
+          <w:bCs/>
+        </w:rPr>
+        <w:t>progresión de dificultad</w:t>
+      </w:r>
+      <w:r>
+        <w:t>.</w:t>
+      </w:r>
+    </w:p>
+    <w:p>
+      <w:r>
+        <w:pict w14:anchorId="757062F0">
+          <v:rect id="_x0000_i1170" style="width:0;height:1.5pt" o:hralign="center" o:hrstd="t" o:hr="t" fillcolor="#a0a0a0" stroked="f"/>
+        </w:pict>
+      </w:r>
+    </w:p>
+    <w:p>
+      <w:pPr>
+        <w:rPr>
+          <w:b/>
+          <w:bCs/>
+        </w:rPr>
+      </w:pPr>
+      <w:r>
+        <w:rPr>
+          <w:b/>
+          <w:bCs/>
+        </w:rPr>
+        <w:t>Pregunta posible del docente</w:t>
+      </w:r>
+    </w:p>
+    <w:p>
+      <w:r>
+        <w:t>"¿Cómo evitaste que el jugador solo memorice el nivel?"</w:t>
+      </w:r>
+    </w:p>
+    <w:p>
+      <w:r>
+        <w:pict w14:anchorId="73907F7B">
+          <v:rect id="_x0000_i1171" style="width:0;height:1.5pt" o:hralign="center" o:hrstd="t" o:hr="t" fillcolor="#a0a0a0" stroked="f"/>
+        </w:pict>
+      </w:r>
+    </w:p>
+    <w:p>
+      <w:pPr>
+        <w:rPr>
+          <w:b/>
+          <w:bCs/>
+        </w:rPr>
+      </w:pPr>
+      <w:r>
+        <w:rPr>
+          <w:b/>
+          <w:bCs/>
+        </w:rPr>
+        <w:t xml:space="preserve">Respuesta que </w:t>
+      </w:r>
+      <w:proofErr w:type="spellStart"/>
+      <w:r>
+        <w:rPr>
+          <w:b/>
+          <w:bCs/>
+        </w:rPr>
+        <w:t>podés</w:t>
+      </w:r>
+      <w:proofErr w:type="spellEnd"/>
+      <w:r>
+        <w:rPr>
+          <w:b/>
+          <w:bCs/>
+        </w:rPr>
+        <w:t xml:space="preserve"> estudiar</w:t>
+      </w:r>
+    </w:p>
+    <w:p>
+      <w:r>
+        <w:t>El diseño del nivel evita que el jugador dependa únicamente de la memorización de patrones.</w:t>
+      </w:r>
+    </w:p>
+    <w:p>
+      <w:r>
+        <w:t>El entorno introduce pequeñas variaciones en las situaciones de juego, lo que obliga al jugador a adaptarse constantemente.</w:t>
+      </w:r>
+    </w:p>
+    <w:p>
+      <w:r>
+        <w:t>La idea es que el jugador realmente domine la mecánica, en lugar de simplemente repetir una secuencia memorizada.</w:t>
+      </w:r>
+    </w:p>
+    <w:p>
+      <w:r>
+        <w:t>Esto genera una experiencia más dinámica, donde cada sección del nivel requiere atención y adaptación, incluso si el jugador ya conoce la habilidad.</w:t>
+      </w:r>
+    </w:p>
+    <w:p>
+      <w:r>
+        <w:pict w14:anchorId="09778574">
+          <v:rect id="_x0000_i1172" style="width:0;height:1.5pt" o:hralign="center" o:hrstd="t" o:hr="t" fillcolor="#a0a0a0" stroked="f"/>
+        </w:pict>
+      </w:r>
+    </w:p>
+    <w:p>
+      <w:pPr>
+        <w:rPr>
+          <w:b/>
+          <w:bCs/>
+        </w:rPr>
+      </w:pPr>
+      <w:r>
+        <w:rPr>
+          <w:b/>
+          <w:bCs/>
+        </w:rPr>
+        <w:t>Idea central</w:t>
+      </w:r>
+    </w:p>
+    <w:p>
+      <w:r>
+        <w:rPr>
+          <w:rFonts w:ascii="Segoe UI Emoji" w:hAnsi="Segoe UI Emoji" w:cs="Segoe UI Emoji"/>
+        </w:rPr>
+        <w:t>🧠</w:t>
+      </w:r>
+      <w:r>
+        <w:t xml:space="preserve"> </w:t>
+      </w:r>
+      <w:r>
+        <w:rPr>
+          <w:b/>
+          <w:bCs/>
+        </w:rPr>
+        <w:t>Dominar mecánicas &gt; memorizar patrones</w:t>
+      </w:r>
+    </w:p>
+    <w:p>
+      <w:r>
+        <w:pict w14:anchorId="494758AE">
+          <v:rect id="_x0000_i1173" style="width:0;height:1.5pt" o:hralign="center" o:hrstd="t" o:hr="t" fillcolor="#a0a0a0" stroked="f"/>
+        </w:pict>
+      </w:r>
+    </w:p>
+    <w:p>
+      <w:pPr>
+        <w:rPr>
+          <w:b/>
+          <w:bCs/>
+        </w:rPr>
+      </w:pPr>
+      <w:r>
+        <w:rPr>
+          <w:b/>
+          <w:bCs/>
+        </w:rPr>
+        <w:t>3️</w:t>
+      </w:r>
+      <w:r>
+        <w:rPr>
+          <w:rFonts w:ascii="Segoe UI Symbol" w:hAnsi="Segoe UI Symbol" w:cs="Segoe UI Symbol"/>
+          <w:b/>
+          <w:bCs/>
+        </w:rPr>
+        <w:t>⃣</w:t>
+      </w:r>
+      <w:r>
+        <w:rPr>
+          <w:b/>
+          <w:bCs/>
+        </w:rPr>
+        <w:t xml:space="preserve"> Presión del entorno</w:t>
+      </w:r>
+    </w:p>
+    <w:p>
+      <w:r>
+        <w:t xml:space="preserve">Acá es donde tu juego </w:t>
+      </w:r>
+      <w:r>
+        <w:rPr>
+          <w:b/>
+          <w:bCs/>
+        </w:rPr>
+        <w:t>se vuelve interesante</w:t>
+      </w:r>
+      <w:r>
+        <w:t>.</w:t>
+      </w:r>
+    </w:p>
+    <w:p>
+      <w:r>
+        <w:t>El jugador ya entiende la mecánica, ahora el entorno lo presiona.</w:t>
+      </w:r>
+    </w:p>
+    <w:p>
+      <w:pPr>
+        <w:numPr>
+          <w:ilvl w:val="0"/>
+          <w:numId w:val="7"/>
+        </w:numPr>
+      </w:pPr>
+      <w:r>
+        <w:t>enemigos</w:t>
+      </w:r>
+    </w:p>
+    <w:p>
+      <w:pPr>
+        <w:numPr>
+          <w:ilvl w:val="0"/>
+          <w:numId w:val="7"/>
+        </w:numPr>
+      </w:pPr>
+      <w:r>
+        <w:t>plataformas</w:t>
+      </w:r>
+    </w:p>
+    <w:p>
+      <w:pPr>
+        <w:numPr>
+          <w:ilvl w:val="0"/>
+          <w:numId w:val="7"/>
+        </w:numPr>
+      </w:pPr>
+      <w:r>
+        <w:t>peligros</w:t>
+      </w:r>
+    </w:p>
+    <w:p>
+      <w:r>
+        <w:lastRenderedPageBreak/>
+        <w:pict w14:anchorId="5121E520">
+          <v:rect id="_x0000_i1174" style="width:0;height:1.5pt" o:hralign="center" o:hrstd="t" o:hr="t" fillcolor="#a0a0a0" stroked="f"/>
+        </w:pict>
+      </w:r>
+    </w:p>
+    <w:p>
+      <w:pPr>
+        <w:rPr>
+          <w:b/>
+          <w:bCs/>
+        </w:rPr>
+      </w:pPr>
+      <w:r>
+        <w:rPr>
+          <w:b/>
+          <w:bCs/>
+        </w:rPr>
+        <w:t xml:space="preserve">Qué explicar mientras </w:t>
+      </w:r>
+      <w:proofErr w:type="spellStart"/>
+      <w:r>
+        <w:rPr>
+          <w:b/>
+          <w:bCs/>
+        </w:rPr>
+        <w:t>jugás</w:t>
+      </w:r>
+      <w:proofErr w:type="spellEnd"/>
+    </w:p>
+    <w:p>
+      <w:r>
+        <w:t>Algo como:</w:t>
+      </w:r>
+    </w:p>
+    <w:p>
+      <w:r>
+        <w:t>"Acá el entorno empieza a generar presión sobre el jugador para que utilice la habilidad de forma más precisa."</w:t>
+      </w:r>
+    </w:p>
+    <w:p>
+      <w:r>
+        <w:t xml:space="preserve">Esto muestra </w:t>
+      </w:r>
+      <w:r>
+        <w:rPr>
+          <w:b/>
+          <w:bCs/>
+        </w:rPr>
+        <w:t>diseño intencional de dificultad</w:t>
+      </w:r>
+      <w:r>
+        <w:t>.</w:t>
+      </w:r>
+    </w:p>
+    <w:p>
+      <w:r>
+        <w:pict w14:anchorId="1C5FD545">
+          <v:rect id="_x0000_i1175" style="width:0;height:1.5pt" o:hralign="center" o:hrstd="t" o:hr="t" fillcolor="#a0a0a0" stroked="f"/>
+        </w:pict>
+      </w:r>
+    </w:p>
+    <w:p>
+      <w:pPr>
+        <w:rPr>
+          <w:b/>
+          <w:bCs/>
+        </w:rPr>
+      </w:pPr>
+      <w:r>
+        <w:rPr>
+          <w:b/>
+          <w:bCs/>
+        </w:rPr>
+        <w:t>Pregunta posible</w:t>
+      </w:r>
+    </w:p>
+    <w:p>
+      <w:r>
+        <w:t>"¿Cómo manejaste la frustración del jugador?"</w:t>
+      </w:r>
+    </w:p>
+    <w:p>
+      <w:r>
+        <w:pict w14:anchorId="238566F9">
+          <v:rect id="_x0000_i1176" style="width:0;height:1.5pt" o:hralign="center" o:hrstd="t" o:hr="t" fillcolor="#a0a0a0" stroked="f"/>
+        </w:pict>
+      </w:r>
+    </w:p>
+    <w:p>
+      <w:pPr>
+        <w:rPr>
+          <w:b/>
+          <w:bCs/>
+        </w:rPr>
+      </w:pPr>
+      <w:r>
+        <w:rPr>
+          <w:b/>
+          <w:bCs/>
+        </w:rPr>
+        <w:t xml:space="preserve">Respuesta que </w:t>
+      </w:r>
+      <w:proofErr w:type="spellStart"/>
+      <w:r>
+        <w:rPr>
+          <w:b/>
+          <w:bCs/>
+        </w:rPr>
+        <w:t>podés</w:t>
+      </w:r>
+      <w:proofErr w:type="spellEnd"/>
+      <w:r>
+        <w:rPr>
+          <w:b/>
+          <w:bCs/>
+        </w:rPr>
+        <w:t xml:space="preserve"> estudiar</w:t>
+      </w:r>
+    </w:p>
+    <w:p>
+      <w:r>
+        <w:t>Aunque el juego presenta desafíos exigentes, el objetivo no es castigar al jugador de forma injusta.</w:t>
+      </w:r>
+    </w:p>
+    <w:p>
+      <w:r>
+        <w:t>Por eso el diseño es progresivo y el juego incluye un sistema de guardado que respeta el progreso del jugador.</w:t>
+      </w:r>
+    </w:p>
+    <w:p>
+      <w:r>
+        <w:t>Esto permite que el jugador experimente desafío sin sentir que pierde demasiado tiempo si comete un error.</w:t>
+      </w:r>
+    </w:p>
+    <w:p>
+      <w:r>
+        <w:t>La intención es que la dificultad genere satisfacción al superarla, no frustración que lleve al abandono.</w:t>
+      </w:r>
+    </w:p>
+    <w:p>
+      <w:r>
+        <w:pict w14:anchorId="4FCC2D0E">
+          <v:rect id="_x0000_i1177" style="width:0;height:1.5pt" o:hralign="center" o:hrstd="t" o:hr="t" fillcolor="#a0a0a0" stroked="f"/>
+        </w:pict>
+      </w:r>
+    </w:p>
+    <w:p>
+      <w:pPr>
+        <w:rPr>
+          <w:b/>
+          <w:bCs/>
+        </w:rPr>
+      </w:pPr>
+      <w:r>
+        <w:rPr>
+          <w:b/>
+          <w:bCs/>
+        </w:rPr>
+        <w:t>Idea central</w:t>
+      </w:r>
+    </w:p>
+    <w:p>
+      <w:r>
+        <w:rPr>
+          <w:rFonts w:ascii="Segoe UI Emoji" w:hAnsi="Segoe UI Emoji" w:cs="Segoe UI Emoji"/>
+        </w:rPr>
+        <w:t>🧠</w:t>
+      </w:r>
+      <w:r>
+        <w:t xml:space="preserve"> </w:t>
+      </w:r>
+      <w:r>
+        <w:rPr>
+          <w:b/>
+          <w:bCs/>
+        </w:rPr>
+        <w:t>Desafío exigente, pero justo.</w:t>
+      </w:r>
+    </w:p>
+    <w:p>
+      <w:r>
+        <w:pict w14:anchorId="66E960AE">
+          <v:rect id="_x0000_i1178" style="width:0;height:1.5pt" o:hralign="center" o:hrstd="t" o:hr="t" fillcolor="#a0a0a0" stroked="f"/>
+        </w:pict>
+      </w:r>
+    </w:p>
+    <w:p>
+      <w:pPr>
+        <w:rPr>
+          <w:b/>
+          <w:bCs/>
+        </w:rPr>
+      </w:pPr>
+      <w:r>
+        <w:rPr>
+          <w:b/>
+          <w:bCs/>
+        </w:rPr>
+        <w:t>4️</w:t>
+      </w:r>
+      <w:r>
+        <w:rPr>
+          <w:rFonts w:ascii="Segoe UI Symbol" w:hAnsi="Segoe UI Symbol" w:cs="Segoe UI Symbol"/>
+          <w:b/>
+          <w:bCs/>
+        </w:rPr>
+        <w:t>⃣</w:t>
+      </w:r>
+      <w:r>
+        <w:rPr>
+          <w:b/>
+          <w:bCs/>
+        </w:rPr>
+        <w:t xml:space="preserve"> Culminación del desafío (final del </w:t>
+      </w:r>
+      <w:proofErr w:type="spellStart"/>
+      <w:r>
+        <w:rPr>
+          <w:b/>
+          <w:bCs/>
+        </w:rPr>
+        <w:t>slice</w:t>
+      </w:r>
+      <w:proofErr w:type="spellEnd"/>
+      <w:r>
+        <w:rPr>
+          <w:b/>
+          <w:bCs/>
+        </w:rPr>
+        <w:t>)</w:t>
+      </w:r>
+    </w:p>
+    <w:p>
+      <w:r>
+        <w:t xml:space="preserve">Este es el momento donde el jugador </w:t>
+      </w:r>
+      <w:r>
+        <w:rPr>
+          <w:b/>
+          <w:bCs/>
+        </w:rPr>
+        <w:t>demuestra todo lo aprendido</w:t>
+      </w:r>
+      <w:r>
+        <w:t>.</w:t>
+      </w:r>
+    </w:p>
+    <w:p>
+      <w:r>
+        <w:t>El nivel ya no enseña.</w:t>
+      </w:r>
+    </w:p>
+    <w:p>
+      <w:r>
+        <w:t xml:space="preserve">El nivel </w:t>
+      </w:r>
+      <w:r>
+        <w:rPr>
+          <w:b/>
+          <w:bCs/>
+        </w:rPr>
+        <w:t>exige</w:t>
+      </w:r>
+      <w:r>
+        <w:t>.</w:t>
+      </w:r>
+    </w:p>
+    <w:p>
+      <w:r>
+        <w:pict w14:anchorId="222ED0F3">
+          <v:rect id="_x0000_i1179" style="width:0;height:1.5pt" o:hralign="center" o:hrstd="t" o:hr="t" fillcolor="#a0a0a0" stroked="f"/>
+        </w:pict>
+      </w:r>
+    </w:p>
+    <w:p>
+      <w:pPr>
+        <w:rPr>
+          <w:b/>
+          <w:bCs/>
+        </w:rPr>
+      </w:pPr>
+      <w:r>
+        <w:rPr>
+          <w:b/>
+          <w:bCs/>
+        </w:rPr>
+        <w:t>Pregunta posible</w:t>
+      </w:r>
+    </w:p>
+    <w:p>
+      <w:r>
+        <w:t xml:space="preserve">"¿Qué </w:t>
+      </w:r>
+      <w:proofErr w:type="spellStart"/>
+      <w:r>
+        <w:t>querés</w:t>
+      </w:r>
+      <w:proofErr w:type="spellEnd"/>
+      <w:r>
+        <w:t xml:space="preserve"> que el jugador sienta al terminar el nivel?"</w:t>
+      </w:r>
+    </w:p>
+    <w:p>
+      <w:r>
+        <w:pict w14:anchorId="7912B6AB">
+          <v:rect id="_x0000_i1180" style="width:0;height:1.5pt" o:hralign="center" o:hrstd="t" o:hr="t" fillcolor="#a0a0a0" stroked="f"/>
+        </w:pict>
+      </w:r>
+    </w:p>
+    <w:p>
+      <w:pPr>
+        <w:rPr>
+          <w:b/>
+          <w:bCs/>
+        </w:rPr>
+      </w:pPr>
+      <w:r>
+        <w:rPr>
+          <w:b/>
+          <w:bCs/>
+        </w:rPr>
+        <w:t xml:space="preserve">Respuesta que </w:t>
+      </w:r>
+      <w:proofErr w:type="spellStart"/>
+      <w:r>
+        <w:rPr>
+          <w:b/>
+          <w:bCs/>
+        </w:rPr>
+        <w:t>podés</w:t>
+      </w:r>
+      <w:proofErr w:type="spellEnd"/>
+      <w:r>
+        <w:rPr>
+          <w:b/>
+          <w:bCs/>
+        </w:rPr>
+        <w:t xml:space="preserve"> estudiar</w:t>
+      </w:r>
+    </w:p>
+    <w:p>
+      <w:r>
+        <w:lastRenderedPageBreak/>
+        <w:t>El objetivo emocional del diseño es que el jugador sienta satisfacción al superar un desafío que inicialmente parecía difícil.</w:t>
+      </w:r>
+    </w:p>
+    <w:p>
+      <w:r>
+        <w:t>A lo largo del nivel el jugador va desarrollando confianza en sus habilidades, porque el juego le va enseñando las mecánicas de manera progresiva.</w:t>
+      </w:r>
+    </w:p>
+    <w:p>
+      <w:r>
+        <w:t>Cuando finalmente logra superar el nivel, la sensación es la de haber dominado un reto técnico, lo que genera orgullo y motivación para continuar jugando y descubrir nuevas habilidades y escenarios.</w:t>
+      </w:r>
+    </w:p>
+    <w:p>
+      <w:r>
+        <w:pict w14:anchorId="5DF6A765">
+          <v:rect id="_x0000_i1181" style="width:0;height:1.5pt" o:hralign="center" o:hrstd="t" o:hr="t" fillcolor="#a0a0a0" stroked="f"/>
+        </w:pict>
+      </w:r>
+    </w:p>
+    <w:p>
+      <w:pPr>
+        <w:rPr>
+          <w:b/>
+          <w:bCs/>
+        </w:rPr>
+      </w:pPr>
+      <w:r>
+        <w:rPr>
+          <w:b/>
+          <w:bCs/>
+        </w:rPr>
+        <w:t>Idea central</w:t>
+      </w:r>
+    </w:p>
+    <w:p>
+      <w:r>
+        <w:rPr>
+          <w:rFonts w:ascii="Segoe UI Emoji" w:hAnsi="Segoe UI Emoji" w:cs="Segoe UI Emoji"/>
+        </w:rPr>
+        <w:t>🧠</w:t>
+      </w:r>
+      <w:r>
+        <w:t xml:space="preserve"> </w:t>
+      </w:r>
+      <w:r>
+        <w:rPr>
+          <w:b/>
+          <w:bCs/>
+        </w:rPr>
+        <w:t>Orgullo por superar el desafío.</w:t>
+      </w:r>
+    </w:p>
+    <w:p>
+      <w:r>
+        <w:pict w14:anchorId="5A80AF79">
+          <v:rect id="_x0000_i1182" style="width:0;height:1.5pt" o:hralign="center" o:hrstd="t" o:hr="t" fillcolor="#a0a0a0" stroked="f"/>
+        </w:pict>
+      </w:r>
+    </w:p>
+    <w:p>
+      <w:pPr>
+        <w:rPr>
+          <w:b/>
+          <w:bCs/>
+        </w:rPr>
+      </w:pPr>
+      <w:r>
+        <w:rPr>
+          <w:rFonts w:ascii="Segoe UI Emoji" w:hAnsi="Segoe UI Emoji" w:cs="Segoe UI Emoji"/>
+          <w:b/>
+          <w:bCs/>
+        </w:rPr>
+        <w:t>🧠</w:t>
+      </w:r>
+      <w:r>
+        <w:rPr>
+          <w:b/>
+          <w:bCs/>
+        </w:rPr>
+        <w:t xml:space="preserve"> Tu estructura mental para jugar y hablar</w:t>
+      </w:r>
+    </w:p>
+    <w:p>
+      <w:r>
+        <w:t xml:space="preserve">Mientras </w:t>
+      </w:r>
+      <w:proofErr w:type="spellStart"/>
+      <w:r>
+        <w:t>jugás</w:t>
+      </w:r>
+      <w:proofErr w:type="spellEnd"/>
+      <w:r>
+        <w:t xml:space="preserve">, </w:t>
+      </w:r>
+      <w:proofErr w:type="spellStart"/>
+      <w:r>
+        <w:t>pensá</w:t>
+      </w:r>
+      <w:proofErr w:type="spellEnd"/>
+      <w:r>
+        <w:t xml:space="preserve"> siempre en esta secuencia:</w:t>
+      </w:r>
+    </w:p>
+    <w:p>
+      <w:r>
+        <w:t>1️</w:t>
+      </w:r>
+      <w:r>
+        <w:rPr>
+          <w:rFonts w:ascii="Segoe UI Symbol" w:hAnsi="Segoe UI Symbol" w:cs="Segoe UI Symbol"/>
+        </w:rPr>
+        <w:t>⃣</w:t>
+      </w:r>
+      <w:r>
+        <w:t xml:space="preserve"> </w:t>
+      </w:r>
+      <w:r>
+        <w:rPr>
+          <w:b/>
+          <w:bCs/>
+        </w:rPr>
+        <w:t>Presentar mecánica</w:t>
+      </w:r>
+      <w:r>
+        <w:br/>
+        <w:t>2️</w:t>
+      </w:r>
+      <w:r>
+        <w:rPr>
+          <w:rFonts w:ascii="Segoe UI Symbol" w:hAnsi="Segoe UI Symbol" w:cs="Segoe UI Symbol"/>
+        </w:rPr>
+        <w:t>⃣</w:t>
+      </w:r>
+      <w:r>
+        <w:t xml:space="preserve"> </w:t>
+      </w:r>
+      <w:r>
+        <w:rPr>
+          <w:b/>
+          <w:bCs/>
+        </w:rPr>
+        <w:t>Practicar mecánica</w:t>
+      </w:r>
+      <w:r>
+        <w:br/>
+        <w:t>3️</w:t>
+      </w:r>
+      <w:r>
+        <w:rPr>
+          <w:rFonts w:ascii="Segoe UI Symbol" w:hAnsi="Segoe UI Symbol" w:cs="Segoe UI Symbol"/>
+        </w:rPr>
+        <w:t>⃣</w:t>
+      </w:r>
+      <w:r>
+        <w:t xml:space="preserve"> </w:t>
+      </w:r>
+      <w:r>
+        <w:rPr>
+          <w:b/>
+          <w:bCs/>
+        </w:rPr>
+        <w:t>Aplicar bajo presión</w:t>
+      </w:r>
+      <w:r>
+        <w:br/>
+        <w:t>4️</w:t>
+      </w:r>
+      <w:r>
+        <w:rPr>
+          <w:rFonts w:ascii="Segoe UI Symbol" w:hAnsi="Segoe UI Symbol" w:cs="Segoe UI Symbol"/>
+        </w:rPr>
+        <w:t>⃣</w:t>
+      </w:r>
+      <w:r>
+        <w:t xml:space="preserve"> </w:t>
+      </w:r>
+      <w:r>
+        <w:rPr>
+          <w:b/>
+          <w:bCs/>
+        </w:rPr>
+        <w:t>Superar desafío</w:t>
+      </w:r>
+    </w:p>
+    <w:p>
+      <w:r>
+        <w:t xml:space="preserve">Si te </w:t>
+      </w:r>
+      <w:proofErr w:type="spellStart"/>
+      <w:r>
+        <w:t>quedás</w:t>
+      </w:r>
+      <w:proofErr w:type="spellEnd"/>
+      <w:r>
+        <w:t xml:space="preserve"> sin palabras, </w:t>
+      </w:r>
+      <w:proofErr w:type="spellStart"/>
+      <w:r>
+        <w:t>volvés</w:t>
+      </w:r>
+      <w:proofErr w:type="spellEnd"/>
+      <w:r>
+        <w:t xml:space="preserve"> a esto.</w:t>
+      </w:r>
+    </w:p>
+    <w:p>
+      <w:r>
+        <w:t xml:space="preserve">Siempre </w:t>
+      </w:r>
+      <w:proofErr w:type="spellStart"/>
+      <w:r>
+        <w:t>podés</w:t>
+      </w:r>
+      <w:proofErr w:type="spellEnd"/>
+      <w:r>
+        <w:t xml:space="preserve"> decir algo como:</w:t>
+      </w:r>
+    </w:p>
+    <w:p>
+      <w:r>
+        <w:t>"Esta sección del nivel está diseñada para reforzar la mecánica que el jugador acaba de aprender."</w:t>
+      </w:r>
+    </w:p>
+    <w:p>
+      <w:r>
+        <w:t xml:space="preserve">Eso ya suena </w:t>
+      </w:r>
+      <w:r>
+        <w:rPr>
+          <w:b/>
+          <w:bCs/>
+        </w:rPr>
+        <w:t>muy profesional</w:t>
+      </w:r>
+      <w:r>
+        <w:t>.</w:t>
+      </w:r>
+    </w:p>
+    <w:p>
+      <w:r>
+        <w:pict w14:anchorId="15D8905F">
+          <v:rect id="_x0000_i1183" style="width:0;height:1.5pt" o:hralign="center" o:hrstd="t" o:hr="t" fillcolor="#a0a0a0" stroked="f"/>
+        </w:pict>
+      </w:r>
+    </w:p>
+    <w:p>
+      <w:pPr>
+        <w:rPr>
+          <w:b/>
+          <w:bCs/>
+        </w:rPr>
+      </w:pPr>
+      <w:r>
+        <w:rPr>
+          <w:rFonts w:ascii="Segoe UI Emoji" w:hAnsi="Segoe UI Emoji" w:cs="Segoe UI Emoji"/>
+          <w:b/>
+          <w:bCs/>
+        </w:rPr>
+        <w:t>🎯</w:t>
+      </w:r>
+      <w:r>
+        <w:rPr>
+          <w:b/>
+          <w:bCs/>
+        </w:rPr>
+        <w:t xml:space="preserve"> Algo importante que hiciste muy bien (y no sabías)</w:t>
+      </w:r>
+    </w:p>
+    <w:p>
+      <w:r>
+        <w:t>Tu juego usa algo que en diseño se llama:</w:t>
+      </w:r>
+    </w:p>
+    <w:p>
+      <w:proofErr w:type="spellStart"/>
+      <w:r>
+        <w:rPr>
+          <w:b/>
+          <w:bCs/>
+        </w:rPr>
+        <w:t>Learning</w:t>
+      </w:r>
+      <w:proofErr w:type="spellEnd"/>
+      <w:r>
+        <w:rPr>
+          <w:b/>
+          <w:bCs/>
+        </w:rPr>
+        <w:t xml:space="preserve"> → </w:t>
+      </w:r>
+      <w:proofErr w:type="spellStart"/>
+      <w:r>
+        <w:rPr>
+          <w:b/>
+          <w:bCs/>
+        </w:rPr>
+        <w:t>Mastery</w:t>
+      </w:r>
+      <w:proofErr w:type="spellEnd"/>
+      <w:r>
+        <w:rPr>
+          <w:b/>
+          <w:bCs/>
+        </w:rPr>
+        <w:t xml:space="preserve"> → </w:t>
+      </w:r>
+      <w:proofErr w:type="spellStart"/>
+      <w:r>
+        <w:rPr>
+          <w:b/>
+          <w:bCs/>
+        </w:rPr>
+        <w:t>Challenge</w:t>
+      </w:r>
+      <w:proofErr w:type="spellEnd"/>
+    </w:p>
+    <w:p>
+      <w:r>
+        <w:t>Esto lo usan juegos muy buenos como:</w:t>
+      </w:r>
+    </w:p>
+    <w:p>
+      <w:pPr>
+        <w:numPr>
+          <w:ilvl w:val="0"/>
+          <w:numId w:val="8"/>
+        </w:numPr>
+      </w:pPr>
+      <w:r>
+        <w:t>Super Mario World</w:t>
+      </w:r>
+    </w:p>
+    <w:p>
+      <w:pPr>
+        <w:numPr>
+          <w:ilvl w:val="0"/>
+          <w:numId w:val="8"/>
+        </w:numPr>
+      </w:pPr>
+      <w:r>
+        <w:t>Celeste</w:t>
+      </w:r>
+    </w:p>
+    <w:p>
+      <w:pPr>
+        <w:numPr>
+          <w:ilvl w:val="0"/>
+          <w:numId w:val="8"/>
+        </w:numPr>
+      </w:pPr>
+      <w:r>
+        <w:t>Mega Man X</w:t>
+      </w:r>
+    </w:p>
+    <w:p>
+      <w:r>
+        <w:t xml:space="preserve">Vos lo aplicaste </w:t>
+      </w:r>
+      <w:r>
+        <w:rPr>
+          <w:b/>
+          <w:bCs/>
+        </w:rPr>
+        <w:t>intuitivamente</w:t>
+      </w:r>
+      <w:r>
+        <w:t>.</w:t>
+      </w:r>
+    </w:p>
+    <w:p>
+      <w:r>
+        <w:t xml:space="preserve">Y eso es algo que </w:t>
+      </w:r>
+      <w:r>
+        <w:rPr>
+          <w:b/>
+          <w:bCs/>
+        </w:rPr>
+        <w:t>vale mucho en una defensa</w:t>
+      </w:r>
+      <w:r>
+        <w:t>.</w:t>
       </w:r>
     </w:p>
     <w:p/>
@@ -2590,6 +3933,453 @@
     </w:lvl>
   </w:abstractNum>
   <w:abstractNum w:abstractNumId="2" w15:restartNumberingAfterBreak="0">
+    <w:nsid w:val="16377932"/>
+    <w:multiLevelType w:val="multilevel"/>
+    <w:tmpl w:val="88D275DC"/>
+    <w:lvl w:ilvl="0">
+      <w:start w:val="1"/>
+      <w:numFmt w:val="bullet"/>
+      <w:lvlText w:val=""/>
+      <w:lvlJc w:val="left"/>
+      <w:pPr>
+        <w:tabs>
+          <w:tab w:val="num" w:pos="720"/>
+        </w:tabs>
+        <w:ind w:left="720" w:hanging="360"/>
+      </w:pPr>
+      <w:rPr>
+        <w:rFonts w:ascii="Symbol" w:hAnsi="Symbol" w:hint="default"/>
+        <w:sz w:val="20"/>
+      </w:rPr>
+    </w:lvl>
+    <w:lvl w:ilvl="1" w:tentative="1">
+      <w:start w:val="1"/>
+      <w:numFmt w:val="bullet"/>
+      <w:lvlText w:val="o"/>
+      <w:lvlJc w:val="left"/>
+      <w:pPr>
+        <w:tabs>
+          <w:tab w:val="num" w:pos="1440"/>
+        </w:tabs>
+        <w:ind w:left="1440" w:hanging="360"/>
+      </w:pPr>
+      <w:rPr>
+        <w:rFonts w:ascii="Courier New" w:hAnsi="Courier New" w:hint="default"/>
+        <w:sz w:val="20"/>
+      </w:rPr>
+    </w:lvl>
+    <w:lvl w:ilvl="2" w:tentative="1">
+      <w:start w:val="1"/>
+      <w:numFmt w:val="bullet"/>
+      <w:lvlText w:val=""/>
+      <w:lvlJc w:val="left"/>
+      <w:pPr>
+        <w:tabs>
+          <w:tab w:val="num" w:pos="2160"/>
+        </w:tabs>
+        <w:ind w:left="2160" w:hanging="360"/>
+      </w:pPr>
+      <w:rPr>
+        <w:rFonts w:ascii="Wingdings" w:hAnsi="Wingdings" w:hint="default"/>
+        <w:sz w:val="20"/>
+      </w:rPr>
+    </w:lvl>
+    <w:lvl w:ilvl="3" w:tentative="1">
+      <w:start w:val="1"/>
+      <w:numFmt w:val="bullet"/>
+      <w:lvlText w:val=""/>
+      <w:lvlJc w:val="left"/>
+      <w:pPr>
+        <w:tabs>
+          <w:tab w:val="num" w:pos="2880"/>
+        </w:tabs>
+        <w:ind w:left="2880" w:hanging="360"/>
+      </w:pPr>
+      <w:rPr>
+        <w:rFonts w:ascii="Wingdings" w:hAnsi="Wingdings" w:hint="default"/>
+        <w:sz w:val="20"/>
+      </w:rPr>
+    </w:lvl>
+    <w:lvl w:ilvl="4" w:tentative="1">
+      <w:start w:val="1"/>
+      <w:numFmt w:val="bullet"/>
+      <w:lvlText w:val=""/>
+      <w:lvlJc w:val="left"/>
+      <w:pPr>
+        <w:tabs>
+          <w:tab w:val="num" w:pos="3600"/>
+        </w:tabs>
+        <w:ind w:left="3600" w:hanging="360"/>
+      </w:pPr>
+      <w:rPr>
+        <w:rFonts w:ascii="Wingdings" w:hAnsi="Wingdings" w:hint="default"/>
+        <w:sz w:val="20"/>
+      </w:rPr>
+    </w:lvl>
+    <w:lvl w:ilvl="5" w:tentative="1">
+      <w:start w:val="1"/>
+      <w:numFmt w:val="bullet"/>
+      <w:lvlText w:val=""/>
+      <w:lvlJc w:val="left"/>
+      <w:pPr>
+        <w:tabs>
+          <w:tab w:val="num" w:pos="4320"/>
+        </w:tabs>
+        <w:ind w:left="4320" w:hanging="360"/>
+      </w:pPr>
+      <w:rPr>
+        <w:rFonts w:ascii="Wingdings" w:hAnsi="Wingdings" w:hint="default"/>
+        <w:sz w:val="20"/>
+      </w:rPr>
+    </w:lvl>
+    <w:lvl w:ilvl="6" w:tentative="1">
+      <w:start w:val="1"/>
+      <w:numFmt w:val="bullet"/>
+      <w:lvlText w:val=""/>
+      <w:lvlJc w:val="left"/>
+      <w:pPr>
+        <w:tabs>
+          <w:tab w:val="num" w:pos="5040"/>
+        </w:tabs>
+        <w:ind w:left="5040" w:hanging="360"/>
+      </w:pPr>
+      <w:rPr>
+        <w:rFonts w:ascii="Wingdings" w:hAnsi="Wingdings" w:hint="default"/>
+        <w:sz w:val="20"/>
+      </w:rPr>
+    </w:lvl>
+    <w:lvl w:ilvl="7" w:tentative="1">
+      <w:start w:val="1"/>
+      <w:numFmt w:val="bullet"/>
+      <w:lvlText w:val=""/>
+      <w:lvlJc w:val="left"/>
+      <w:pPr>
+        <w:tabs>
+          <w:tab w:val="num" w:pos="5760"/>
+        </w:tabs>
+        <w:ind w:left="5760" w:hanging="360"/>
+      </w:pPr>
+      <w:rPr>
+        <w:rFonts w:ascii="Wingdings" w:hAnsi="Wingdings" w:hint="default"/>
+        <w:sz w:val="20"/>
+      </w:rPr>
+    </w:lvl>
+    <w:lvl w:ilvl="8" w:tentative="1">
+      <w:start w:val="1"/>
+      <w:numFmt w:val="bullet"/>
+      <w:lvlText w:val=""/>
+      <w:lvlJc w:val="left"/>
+      <w:pPr>
+        <w:tabs>
+          <w:tab w:val="num" w:pos="6480"/>
+        </w:tabs>
+        <w:ind w:left="6480" w:hanging="360"/>
+      </w:pPr>
+      <w:rPr>
+        <w:rFonts w:ascii="Wingdings" w:hAnsi="Wingdings" w:hint="default"/>
+        <w:sz w:val="20"/>
+      </w:rPr>
+    </w:lvl>
+  </w:abstractNum>
+  <w:abstractNum w:abstractNumId="3" w15:restartNumberingAfterBreak="0">
+    <w:nsid w:val="20312772"/>
+    <w:multiLevelType w:val="multilevel"/>
+    <w:tmpl w:val="FBEC21D8"/>
+    <w:lvl w:ilvl="0">
+      <w:start w:val="1"/>
+      <w:numFmt w:val="bullet"/>
+      <w:lvlText w:val=""/>
+      <w:lvlJc w:val="left"/>
+      <w:pPr>
+        <w:tabs>
+          <w:tab w:val="num" w:pos="720"/>
+        </w:tabs>
+        <w:ind w:left="720" w:hanging="360"/>
+      </w:pPr>
+      <w:rPr>
+        <w:rFonts w:ascii="Symbol" w:hAnsi="Symbol" w:hint="default"/>
+        <w:sz w:val="20"/>
+      </w:rPr>
+    </w:lvl>
+    <w:lvl w:ilvl="1" w:tentative="1">
+      <w:start w:val="1"/>
+      <w:numFmt w:val="bullet"/>
+      <w:lvlText w:val="o"/>
+      <w:lvlJc w:val="left"/>
+      <w:pPr>
+        <w:tabs>
+          <w:tab w:val="num" w:pos="1440"/>
+        </w:tabs>
+        <w:ind w:left="1440" w:hanging="360"/>
+      </w:pPr>
+      <w:rPr>
+        <w:rFonts w:ascii="Courier New" w:hAnsi="Courier New" w:hint="default"/>
+        <w:sz w:val="20"/>
+      </w:rPr>
+    </w:lvl>
+    <w:lvl w:ilvl="2" w:tentative="1">
+      <w:start w:val="1"/>
+      <w:numFmt w:val="bullet"/>
+      <w:lvlText w:val=""/>
+      <w:lvlJc w:val="left"/>
+      <w:pPr>
+        <w:tabs>
+          <w:tab w:val="num" w:pos="2160"/>
+        </w:tabs>
+        <w:ind w:left="2160" w:hanging="360"/>
+      </w:pPr>
+      <w:rPr>
+        <w:rFonts w:ascii="Wingdings" w:hAnsi="Wingdings" w:hint="default"/>
+        <w:sz w:val="20"/>
+      </w:rPr>
+    </w:lvl>
+    <w:lvl w:ilvl="3" w:tentative="1">
+      <w:start w:val="1"/>
+      <w:numFmt w:val="bullet"/>
+      <w:lvlText w:val=""/>
+      <w:lvlJc w:val="left"/>
+      <w:pPr>
+        <w:tabs>
+          <w:tab w:val="num" w:pos="2880"/>
+        </w:tabs>
+        <w:ind w:left="2880" w:hanging="360"/>
+      </w:pPr>
+      <w:rPr>
+        <w:rFonts w:ascii="Wingdings" w:hAnsi="Wingdings" w:hint="default"/>
+        <w:sz w:val="20"/>
+      </w:rPr>
+    </w:lvl>
+    <w:lvl w:ilvl="4" w:tentative="1">
+      <w:start w:val="1"/>
+      <w:numFmt w:val="bullet"/>
+      <w:lvlText w:val=""/>
+      <w:lvlJc w:val="left"/>
+      <w:pPr>
+        <w:tabs>
+          <w:tab w:val="num" w:pos="3600"/>
+        </w:tabs>
+        <w:ind w:left="3600" w:hanging="360"/>
+      </w:pPr>
+      <w:rPr>
+        <w:rFonts w:ascii="Wingdings" w:hAnsi="Wingdings" w:hint="default"/>
+        <w:sz w:val="20"/>
+      </w:rPr>
+    </w:lvl>
+    <w:lvl w:ilvl="5" w:tentative="1">
+      <w:start w:val="1"/>
+      <w:numFmt w:val="bullet"/>
+      <w:lvlText w:val=""/>
+      <w:lvlJc w:val="left"/>
+      <w:pPr>
+        <w:tabs>
+          <w:tab w:val="num" w:pos="4320"/>
+        </w:tabs>
+        <w:ind w:left="4320" w:hanging="360"/>
+      </w:pPr>
+      <w:rPr>
+        <w:rFonts w:ascii="Wingdings" w:hAnsi="Wingdings" w:hint="default"/>
+        <w:sz w:val="20"/>
+      </w:rPr>
+    </w:lvl>
+    <w:lvl w:ilvl="6" w:tentative="1">
+      <w:start w:val="1"/>
+      <w:numFmt w:val="bullet"/>
+      <w:lvlText w:val=""/>
+      <w:lvlJc w:val="left"/>
+      <w:pPr>
+        <w:tabs>
+          <w:tab w:val="num" w:pos="5040"/>
+        </w:tabs>
+        <w:ind w:left="5040" w:hanging="360"/>
+      </w:pPr>
+      <w:rPr>
+        <w:rFonts w:ascii="Wingdings" w:hAnsi="Wingdings" w:hint="default"/>
+        <w:sz w:val="20"/>
+      </w:rPr>
+    </w:lvl>
+    <w:lvl w:ilvl="7" w:tentative="1">
+      <w:start w:val="1"/>
+      <w:numFmt w:val="bullet"/>
+      <w:lvlText w:val=""/>
+      <w:lvlJc w:val="left"/>
+      <w:pPr>
+        <w:tabs>
+          <w:tab w:val="num" w:pos="5760"/>
+        </w:tabs>
+        <w:ind w:left="5760" w:hanging="360"/>
+      </w:pPr>
+      <w:rPr>
+        <w:rFonts w:ascii="Wingdings" w:hAnsi="Wingdings" w:hint="default"/>
+        <w:sz w:val="20"/>
+      </w:rPr>
+    </w:lvl>
+    <w:lvl w:ilvl="8" w:tentative="1">
+      <w:start w:val="1"/>
+      <w:numFmt w:val="bullet"/>
+      <w:lvlText w:val=""/>
+      <w:lvlJc w:val="left"/>
+      <w:pPr>
+        <w:tabs>
+          <w:tab w:val="num" w:pos="6480"/>
+        </w:tabs>
+        <w:ind w:left="6480" w:hanging="360"/>
+      </w:pPr>
+      <w:rPr>
+        <w:rFonts w:ascii="Wingdings" w:hAnsi="Wingdings" w:hint="default"/>
+        <w:sz w:val="20"/>
+      </w:rPr>
+    </w:lvl>
+  </w:abstractNum>
+  <w:abstractNum w:abstractNumId="4" w15:restartNumberingAfterBreak="0">
+    <w:nsid w:val="468A5956"/>
+    <w:multiLevelType w:val="multilevel"/>
+    <w:tmpl w:val="E7B82270"/>
+    <w:lvl w:ilvl="0">
+      <w:start w:val="1"/>
+      <w:numFmt w:val="bullet"/>
+      <w:lvlText w:val=""/>
+      <w:lvlJc w:val="left"/>
+      <w:pPr>
+        <w:tabs>
+          <w:tab w:val="num" w:pos="720"/>
+        </w:tabs>
+        <w:ind w:left="720" w:hanging="360"/>
+      </w:pPr>
+      <w:rPr>
+        <w:rFonts w:ascii="Symbol" w:hAnsi="Symbol" w:hint="default"/>
+        <w:sz w:val="20"/>
+      </w:rPr>
+    </w:lvl>
+    <w:lvl w:ilvl="1" w:tentative="1">
+      <w:start w:val="1"/>
+      <w:numFmt w:val="bullet"/>
+      <w:lvlText w:val="o"/>
+      <w:lvlJc w:val="left"/>
+      <w:pPr>
+        <w:tabs>
+          <w:tab w:val="num" w:pos="1440"/>
+        </w:tabs>
+        <w:ind w:left="1440" w:hanging="360"/>
+      </w:pPr>
+      <w:rPr>
+        <w:rFonts w:ascii="Courier New" w:hAnsi="Courier New" w:hint="default"/>
+        <w:sz w:val="20"/>
+      </w:rPr>
+    </w:lvl>
+    <w:lvl w:ilvl="2" w:tentative="1">
+      <w:start w:val="1"/>
+      <w:numFmt w:val="bullet"/>
+      <w:lvlText w:val=""/>
+      <w:lvlJc w:val="left"/>
+      <w:pPr>
+        <w:tabs>
+          <w:tab w:val="num" w:pos="2160"/>
+        </w:tabs>
+        <w:ind w:left="2160" w:hanging="360"/>
+      </w:pPr>
+      <w:rPr>
+        <w:rFonts w:ascii="Wingdings" w:hAnsi="Wingdings" w:hint="default"/>
+        <w:sz w:val="20"/>
+      </w:rPr>
+    </w:lvl>
+    <w:lvl w:ilvl="3" w:tentative="1">
+      <w:start w:val="1"/>
+      <w:numFmt w:val="bullet"/>
+      <w:lvlText w:val=""/>
+      <w:lvlJc w:val="left"/>
+      <w:pPr>
+        <w:tabs>
+          <w:tab w:val="num" w:pos="2880"/>
+        </w:tabs>
+        <w:ind w:left="2880" w:hanging="360"/>
+      </w:pPr>
+      <w:rPr>
+        <w:rFonts w:ascii="Wingdings" w:hAnsi="Wingdings" w:hint="default"/>
+        <w:sz w:val="20"/>
+      </w:rPr>
+    </w:lvl>
+    <w:lvl w:ilvl="4" w:tentative="1">
+      <w:start w:val="1"/>
+      <w:numFmt w:val="bullet"/>
+      <w:lvlText w:val=""/>
+      <w:lvlJc w:val="left"/>
+      <w:pPr>
+        <w:tabs>
+          <w:tab w:val="num" w:pos="3600"/>
+        </w:tabs>
+        <w:ind w:left="3600" w:hanging="360"/>
+      </w:pPr>
+      <w:rPr>
+        <w:rFonts w:ascii="Wingdings" w:hAnsi="Wingdings" w:hint="default"/>
+        <w:sz w:val="20"/>
+      </w:rPr>
+    </w:lvl>
+    <w:lvl w:ilvl="5" w:tentative="1">
+      <w:start w:val="1"/>
+      <w:numFmt w:val="bullet"/>
+      <w:lvlText w:val=""/>
+      <w:lvlJc w:val="left"/>
+      <w:pPr>
+        <w:tabs>
+          <w:tab w:val="num" w:pos="4320"/>
+        </w:tabs>
+        <w:ind w:left="4320" w:hanging="360"/>
+      </w:pPr>
+      <w:rPr>
+        <w:rFonts w:ascii="Wingdings" w:hAnsi="Wingdings" w:hint="default"/>
+        <w:sz w:val="20"/>
+      </w:rPr>
+    </w:lvl>
+    <w:lvl w:ilvl="6" w:tentative="1">
+      <w:start w:val="1"/>
+      <w:numFmt w:val="bullet"/>
+      <w:lvlText w:val=""/>
+      <w:lvlJc w:val="left"/>
+      <w:pPr>
+        <w:tabs>
+          <w:tab w:val="num" w:pos="5040"/>
+        </w:tabs>
+        <w:ind w:left="5040" w:hanging="360"/>
+      </w:pPr>
+      <w:rPr>
+        <w:rFonts w:ascii="Wingdings" w:hAnsi="Wingdings" w:hint="default"/>
+        <w:sz w:val="20"/>
+      </w:rPr>
+    </w:lvl>
+    <w:lvl w:ilvl="7" w:tentative="1">
+      <w:start w:val="1"/>
+      <w:numFmt w:val="bullet"/>
+      <w:lvlText w:val=""/>
+      <w:lvlJc w:val="left"/>
+      <w:pPr>
+        <w:tabs>
+          <w:tab w:val="num" w:pos="5760"/>
+        </w:tabs>
+        <w:ind w:left="5760" w:hanging="360"/>
+      </w:pPr>
+      <w:rPr>
+        <w:rFonts w:ascii="Wingdings" w:hAnsi="Wingdings" w:hint="default"/>
+        <w:sz w:val="20"/>
+      </w:rPr>
+    </w:lvl>
+    <w:lvl w:ilvl="8" w:tentative="1">
+      <w:start w:val="1"/>
+      <w:numFmt w:val="bullet"/>
+      <w:lvlText w:val=""/>
+      <w:lvlJc w:val="left"/>
+      <w:pPr>
+        <w:tabs>
+          <w:tab w:val="num" w:pos="6480"/>
+        </w:tabs>
+        <w:ind w:left="6480" w:hanging="360"/>
+      </w:pPr>
+      <w:rPr>
+        <w:rFonts w:ascii="Wingdings" w:hAnsi="Wingdings" w:hint="default"/>
+        <w:sz w:val="20"/>
+      </w:rPr>
+    </w:lvl>
+  </w:abstractNum>
+  <w:abstractNum w:abstractNumId="5" w15:restartNumberingAfterBreak="0">
     <w:nsid w:val="473A4DD4"/>
     <w:multiLevelType w:val="multilevel"/>
     <w:tmpl w:val="F5600FCA"/>
@@ -2738,7 +4528,7 @@
       </w:rPr>
     </w:lvl>
   </w:abstractNum>
-  <w:abstractNum w:abstractNumId="3" w15:restartNumberingAfterBreak="0">
+  <w:abstractNum w:abstractNumId="6" w15:restartNumberingAfterBreak="0">
     <w:nsid w:val="67AE3EE0"/>
     <w:multiLevelType w:val="multilevel"/>
     <w:tmpl w:val="951A8C98"/>
@@ -2851,7 +4641,7 @@
       </w:pPr>
     </w:lvl>
   </w:abstractNum>
-  <w:abstractNum w:abstractNumId="4" w15:restartNumberingAfterBreak="0">
+  <w:abstractNum w:abstractNumId="7" w15:restartNumberingAfterBreak="0">
     <w:nsid w:val="75F46F09"/>
     <w:multiLevelType w:val="multilevel"/>
     <w:tmpl w:val="087498AA"/>
@@ -3004,16 +4794,25 @@
     <w:abstractNumId w:val="0"/>
   </w:num>
   <w:num w:numId="2" w16cid:durableId="461773415">
-    <w:abstractNumId w:val="2"/>
+    <w:abstractNumId w:val="5"/>
   </w:num>
   <w:num w:numId="3" w16cid:durableId="2079207532">
     <w:abstractNumId w:val="1"/>
   </w:num>
   <w:num w:numId="4" w16cid:durableId="521821493">
+    <w:abstractNumId w:val="6"/>
+  </w:num>
+  <w:num w:numId="5" w16cid:durableId="823743288">
+    <w:abstractNumId w:val="7"/>
+  </w:num>
+  <w:num w:numId="6" w16cid:durableId="1839464752">
     <w:abstractNumId w:val="3"/>
   </w:num>
-  <w:num w:numId="5" w16cid:durableId="823743288">
+  <w:num w:numId="7" w16cid:durableId="1471485332">
     <w:abstractNumId w:val="4"/>
+  </w:num>
+  <w:num w:numId="8" w16cid:durableId="1954946153">
+    <w:abstractNumId w:val="2"/>
   </w:num>
 </w:numbering>
 </file>

</xml_diff>